<commit_message>
docs: rewrite IT14 as plain record questions with concrete context
</commit_message>
<xml_diff>
--- a/6-人才与组织/部门AI专员跟进/IT部-陈承-跟进-2026-10-07-SC8现有记录核对.docx
+++ b/6-人才与组织/部门AI专员跟进/IT部-陈承-跟进-2026-10-07-SC8现有记录核对.docx
@@ -5,32 +5,28 @@
     <w:p>
       <w:pPr>
         <w:pStyle w:val="Title"/>
-        <w:spacing w:after="100" w:line="276" w:lineRule="auto"/>
-        <w:jc w:val="center"/>
       </w:pPr>
       <w:r>
         <w:rPr>
-          <w:rFonts w:ascii="Microsoft YaHei" w:hAnsi="Microsoft YaHei" w:eastAsia="Microsoft YaHei" w:cs="Microsoft YaHei"/>
+          <w:rFonts w:ascii="Microsoft YaHei" w:hAnsi="Microsoft YaHei"/>
           <w:b/>
+          <w:vanish w:val="0"/>
           <w:color w:val="000000"/>
-          <w:sz w:val="40"/>
+          <w:sz w:val="36"/>
         </w:rPr>
-        <w:t>IT部第14封跟进信 SC8现有记录核对</w:t>
+        <w:t>IT部第14封跟进信 请协助查找两项记录</w:t>
       </w:r>
     </w:p>
+    <w:p/>
     <w:p>
       <w:pPr>
-        <w:spacing w:after="100" w:line="276" w:lineRule="auto"/>
-      </w:pPr>
-    </w:p>
-    <w:p>
-      <w:pPr>
-        <w:spacing w:after="100" w:line="276" w:lineRule="auto"/>
+        <w:spacing w:after="100"/>
       </w:pPr>
       <w:r>
         <w:rPr>
           <w:rFonts w:ascii="Microsoft YaHei" w:hAnsi="Microsoft YaHei" w:eastAsia="Microsoft YaHei" w:cs="Microsoft YaHei"/>
           <w:b w:val="0"/>
+          <w:color w:val="000000"/>
           <w:sz w:val="21"/>
         </w:rPr>
         <w:t>陈承：</w:t>
@@ -38,21 +34,22 @@
     </w:p>
     <w:p>
       <w:pPr>
-        <w:spacing w:after="100" w:line="276" w:lineRule="auto"/>
+        <w:spacing w:after="100"/>
       </w:pPr>
       <w:r>
         <w:rPr>
           <w:rFonts w:ascii="Microsoft YaHei" w:hAnsi="Microsoft YaHei" w:eastAsia="Microsoft YaHei" w:cs="Microsoft YaHei"/>
           <w:b w:val="0"/>
+          <w:color w:val="000000"/>
           <w:sz w:val="21"/>
         </w:rPr>
-        <w:t>SC8 离线验证目前需要核清已有数据的来历和使用范围。Shao Peishen 已在线下转交材料，请先回复能确定的部分；不能一次答全也可以。下列六题，前三题勾选，后三题短填。选择“不确定”或“暂不能提供”即可，不必为本信重新导出数据或制作报告。</w:t>
+        <w:t>请帮忙找一下下面两项记录，回复保存位置或链接即可。</w:t>
       </w:r>
     </w:p>
     <w:p>
       <w:pPr>
         <w:pStyle w:val="Heading2"/>
-        <w:spacing w:before="260" w:after="100" w:line="276" w:lineRule="auto"/>
+        <w:spacing w:before="260" w:after="120"/>
       </w:pPr>
       <w:r>
         <w:rPr>
@@ -61,26 +58,27 @@
           <w:color w:val="000000"/>
           <w:sz w:val="28"/>
         </w:rPr>
-        <w:t>一 已由业务线核验的事项</w:t>
+        <w:t>一 SC8验证的使用范围和客户数据处理说明</w:t>
       </w:r>
     </w:p>
     <w:p>
       <w:pPr>
-        <w:spacing w:after="100" w:line="276" w:lineRule="auto"/>
+        <w:spacing w:after="100"/>
       </w:pPr>
       <w:r>
         <w:rPr>
           <w:rFonts w:ascii="Microsoft YaHei" w:hAnsi="Microsoft YaHei" w:eastAsia="Microsoft YaHei" w:cs="Microsoft YaHei"/>
           <w:b w:val="0"/>
+          <w:color w:val="000000"/>
           <w:sz w:val="21"/>
         </w:rPr>
-        <w:t>仓库已有历史冻结文件，其中 SMT 标为 mock。历史文件尚不能证明采集时间、生产当时配置和本轮使用依据。文件 SHA256、Git 版本、比较脚本所需格式由业务线继续核验，IT 无需计算或补写这些技术信息。</w:t>
+        <w:t>10月7日，SC8“客户订单交期智能承诺”做过一次数据验证。请帮忙找当时已有的邮件、审批或说明，能看出这批数据可以用于哪些内部验证、不同客户的数据如何分开处理。只需回复记录在哪里。</w:t>
       </w:r>
     </w:p>
     <w:p>
       <w:pPr>
         <w:pStyle w:val="Heading2"/>
-        <w:spacing w:before="260" w:after="100" w:line="276" w:lineRule="auto"/>
+        <w:spacing w:before="260" w:after="120"/>
       </w:pPr>
       <w:r>
         <w:rPr>
@@ -89,463 +87,27 @@
           <w:color w:val="000000"/>
           <w:sz w:val="28"/>
         </w:rPr>
-        <w:t>二 请勾选三题</w:t>
+        <w:t>二 ERP下单326行、收货90行的原记录</w:t>
       </w:r>
     </w:p>
     <w:p>
       <w:pPr>
-        <w:keepNext/>
-        <w:spacing w:after="100" w:line="276" w:lineRule="auto"/>
+        <w:spacing w:after="100"/>
       </w:pPr>
       <w:r>
         <w:rPr>
           <w:rFonts w:ascii="Microsoft YaHei" w:hAnsi="Microsoft YaHei" w:eastAsia="Microsoft YaHei" w:cs="Microsoft YaHei"/>
-          <w:b/>
+          <w:b w:val="0"/>
+          <w:color w:val="000000"/>
           <w:sz w:val="21"/>
         </w:rPr>
-        <w:t>1 现有材料的可提供状态是什么 单选</w:t>
-      </w:r>
-    </w:p>
-    <w:p>
-      <w:pPr>
-        <w:spacing w:after="100" w:line="276" w:lineRule="auto"/>
-      </w:pPr>
-      <w:sdt>
-        <w:sdtPr>
-          <w:rPr>
-            <w:rFonts w:ascii="MS Gothic" w:eastAsia="MS Gothic" w:hAnsi="MS Gothic" w:cs="MS Gothic"/>
-            <w:sz w:val="21"/>
-          </w:rPr>
-          <w:id w:val="100000001"/>
-          <w14:checkbox>
-            <w14:checked w14:val="0"/>
-            <w14:checkedState w14:val="2611" w14:font="MS Gothic"/>
-            <w14:uncheckedState w14:val="2610" w14:font="MS Gothic"/>
-          </w14:checkbox>
-        </w:sdtPr>
-        <w:sdtEndPr/>
-        <w:sdtContent>
-          <w:r>
-            <w:rPr>
-              <w:rFonts w:ascii="MS Gothic" w:eastAsia="MS Gothic" w:hAnsi="MS Gothic" w:cs="MS Gothic"/>
-              <w:sz w:val="21"/>
-            </w:rPr>
-            <w:t>☐</w:t>
-          </w:r>
-        </w:sdtContent>
-      </w:sdt>
-      <w:r>
-        <w:rPr>
-          <w:rFonts w:ascii="Microsoft YaHei" w:hAnsi="Microsoft YaHei" w:eastAsia="Microsoft YaHei" w:cs="Microsoft YaHei"/>
-          <w:b w:val="0"/>
-          <w:sz w:val="21"/>
-        </w:rPr>
-        <w:t xml:space="preserve"> A 已找到现成 SC8 输入缓存或导出文件，可提供位置</w:t>
-      </w:r>
-    </w:p>
-    <w:p>
-      <w:pPr>
-        <w:spacing w:after="100" w:line="276" w:lineRule="auto"/>
-      </w:pPr>
-      <w:sdt>
-        <w:sdtPr>
-          <w:rPr>
-            <w:rFonts w:ascii="MS Gothic" w:eastAsia="MS Gothic" w:hAnsi="MS Gothic" w:cs="MS Gothic"/>
-            <w:sz w:val="21"/>
-          </w:rPr>
-          <w:id w:val="100000002"/>
-          <w14:checkbox>
-            <w14:checked w14:val="0"/>
-            <w14:checkedState w14:val="2611" w14:font="MS Gothic"/>
-            <w14:uncheckedState w14:val="2610" w14:font="MS Gothic"/>
-          </w14:checkbox>
-        </w:sdtPr>
-        <w:sdtEndPr/>
-        <w:sdtContent>
-          <w:r>
-            <w:rPr>
-              <w:rFonts w:ascii="MS Gothic" w:eastAsia="MS Gothic" w:hAnsi="MS Gothic" w:cs="MS Gothic"/>
-              <w:sz w:val="21"/>
-            </w:rPr>
-            <w:t>☐</w:t>
-          </w:r>
-        </w:sdtContent>
-      </w:sdt>
-      <w:r>
-        <w:rPr>
-          <w:rFonts w:ascii="Microsoft YaHei" w:hAnsi="Microsoft YaHei" w:eastAsia="Microsoft YaHei" w:cs="Microsoft YaHei"/>
-          <w:b w:val="0"/>
-          <w:sz w:val="21"/>
-        </w:rPr>
-        <w:t xml:space="preserve"> B 目前仅找到历史冻结文件</w:t>
-      </w:r>
-    </w:p>
-    <w:p>
-      <w:pPr>
-        <w:spacing w:after="100" w:line="276" w:lineRule="auto"/>
-      </w:pPr>
-      <w:sdt>
-        <w:sdtPr>
-          <w:rPr>
-            <w:rFonts w:ascii="MS Gothic" w:eastAsia="MS Gothic" w:hAnsi="MS Gothic" w:cs="MS Gothic"/>
-            <w:sz w:val="21"/>
-          </w:rPr>
-          <w:id w:val="100000003"/>
-          <w14:checkbox>
-            <w14:checked w14:val="0"/>
-            <w14:checkedState w14:val="2611" w14:font="MS Gothic"/>
-            <w14:uncheckedState w14:val="2610" w14:font="MS Gothic"/>
-          </w14:checkbox>
-        </w:sdtPr>
-        <w:sdtEndPr/>
-        <w:sdtContent>
-          <w:r>
-            <w:rPr>
-              <w:rFonts w:ascii="MS Gothic" w:eastAsia="MS Gothic" w:hAnsi="MS Gothic" w:cs="MS Gothic"/>
-              <w:sz w:val="21"/>
-            </w:rPr>
-            <w:t>☐</w:t>
-          </w:r>
-        </w:sdtContent>
-      </w:sdt>
-      <w:r>
-        <w:rPr>
-          <w:rFonts w:ascii="Microsoft YaHei" w:hAnsi="Microsoft YaHei" w:eastAsia="Microsoft YaHei" w:cs="Microsoft YaHei"/>
-          <w:b w:val="0"/>
-          <w:sz w:val="21"/>
-        </w:rPr>
-        <w:t xml:space="preserve"> C 已查过，暂未找到可提供的材料</w:t>
-      </w:r>
-    </w:p>
-    <w:p>
-      <w:pPr>
-        <w:spacing w:after="100" w:line="276" w:lineRule="auto"/>
-      </w:pPr>
-      <w:sdt>
-        <w:sdtPr>
-          <w:rPr>
-            <w:rFonts w:ascii="MS Gothic" w:eastAsia="MS Gothic" w:hAnsi="MS Gothic" w:cs="MS Gothic"/>
-            <w:sz w:val="21"/>
-          </w:rPr>
-          <w:id w:val="100000004"/>
-          <w14:checkbox>
-            <w14:checked w14:val="0"/>
-            <w14:checkedState w14:val="2611" w14:font="MS Gothic"/>
-            <w14:uncheckedState w14:val="2610" w14:font="MS Gothic"/>
-          </w14:checkbox>
-        </w:sdtPr>
-        <w:sdtEndPr/>
-        <w:sdtContent>
-          <w:r>
-            <w:rPr>
-              <w:rFonts w:ascii="MS Gothic" w:eastAsia="MS Gothic" w:hAnsi="MS Gothic" w:cs="MS Gothic"/>
-              <w:sz w:val="21"/>
-            </w:rPr>
-            <w:t>☐</w:t>
-          </w:r>
-        </w:sdtContent>
-      </w:sdt>
-      <w:r>
-        <w:rPr>
-          <w:rFonts w:ascii="Microsoft YaHei" w:hAnsi="Microsoft YaHei" w:eastAsia="Microsoft YaHei" w:cs="Microsoft YaHei"/>
-          <w:b w:val="0"/>
-          <w:sz w:val="21"/>
-        </w:rPr>
-        <w:t xml:space="preserve"> D 还需核对，暂不确定</w:t>
-      </w:r>
-    </w:p>
-    <w:p>
-      <w:pPr>
-        <w:keepNext/>
-        <w:spacing w:after="100" w:line="276" w:lineRule="auto"/>
-      </w:pPr>
-      <w:r>
-        <w:rPr>
-          <w:rFonts w:ascii="Microsoft YaHei" w:hAnsi="Microsoft YaHei" w:eastAsia="Microsoft YaHei" w:cs="Microsoft YaHei"/>
-          <w:b/>
-          <w:sz w:val="21"/>
-        </w:rPr>
-        <w:t>2 判断 现有日志或记录能辨认各类数据的采集时间</w:t>
-      </w:r>
-    </w:p>
-    <w:p>
-      <w:pPr>
-        <w:spacing w:after="100" w:line="276" w:lineRule="auto"/>
-      </w:pPr>
-      <w:sdt>
-        <w:sdtPr>
-          <w:rPr>
-            <w:rFonts w:ascii="MS Gothic" w:eastAsia="MS Gothic" w:hAnsi="MS Gothic" w:cs="MS Gothic"/>
-            <w:sz w:val="21"/>
-          </w:rPr>
-          <w:id w:val="100000005"/>
-          <w14:checkbox>
-            <w14:checked w14:val="0"/>
-            <w14:checkedState w14:val="2611" w14:font="MS Gothic"/>
-            <w14:uncheckedState w14:val="2610" w14:font="MS Gothic"/>
-          </w14:checkbox>
-        </w:sdtPr>
-        <w:sdtEndPr/>
-        <w:sdtContent>
-          <w:r>
-            <w:rPr>
-              <w:rFonts w:ascii="MS Gothic" w:eastAsia="MS Gothic" w:hAnsi="MS Gothic" w:cs="MS Gothic"/>
-              <w:sz w:val="21"/>
-            </w:rPr>
-            <w:t>☐</w:t>
-          </w:r>
-        </w:sdtContent>
-      </w:sdt>
-      <w:r>
-        <w:rPr>
-          <w:rFonts w:ascii="Microsoft YaHei" w:hAnsi="Microsoft YaHei" w:eastAsia="Microsoft YaHei" w:cs="Microsoft YaHei"/>
-          <w:b w:val="0"/>
-          <w:sz w:val="21"/>
-        </w:rPr>
-        <w:t xml:space="preserve"> 对，已有记录能辨认</w:t>
-      </w:r>
-    </w:p>
-    <w:p>
-      <w:pPr>
-        <w:spacing w:after="100" w:line="276" w:lineRule="auto"/>
-      </w:pPr>
-      <w:sdt>
-        <w:sdtPr>
-          <w:rPr>
-            <w:rFonts w:ascii="MS Gothic" w:eastAsia="MS Gothic" w:hAnsi="MS Gothic" w:cs="MS Gothic"/>
-            <w:sz w:val="21"/>
-          </w:rPr>
-          <w:id w:val="100000006"/>
-          <w14:checkbox>
-            <w14:checked w14:val="0"/>
-            <w14:checkedState w14:val="2611" w14:font="MS Gothic"/>
-            <w14:uncheckedState w14:val="2610" w14:font="MS Gothic"/>
-          </w14:checkbox>
-        </w:sdtPr>
-        <w:sdtEndPr/>
-        <w:sdtContent>
-          <w:r>
-            <w:rPr>
-              <w:rFonts w:ascii="MS Gothic" w:eastAsia="MS Gothic" w:hAnsi="MS Gothic" w:cs="MS Gothic"/>
-              <w:sz w:val="21"/>
-            </w:rPr>
-            <w:t>☐</w:t>
-          </w:r>
-        </w:sdtContent>
-      </w:sdt>
-      <w:r>
-        <w:rPr>
-          <w:rFonts w:ascii="Microsoft YaHei" w:hAnsi="Microsoft YaHei" w:eastAsia="Microsoft YaHei" w:cs="Microsoft YaHei"/>
-          <w:b w:val="0"/>
-          <w:sz w:val="21"/>
-        </w:rPr>
-        <w:t xml:space="preserve"> 不完全对，只能辨认部分</w:t>
-      </w:r>
-    </w:p>
-    <w:p>
-      <w:pPr>
-        <w:spacing w:after="100" w:line="276" w:lineRule="auto"/>
-      </w:pPr>
-      <w:sdt>
-        <w:sdtPr>
-          <w:rPr>
-            <w:rFonts w:ascii="MS Gothic" w:eastAsia="MS Gothic" w:hAnsi="MS Gothic" w:cs="MS Gothic"/>
-            <w:sz w:val="21"/>
-          </w:rPr>
-          <w:id w:val="100000007"/>
-          <w14:checkbox>
-            <w14:checked w14:val="0"/>
-            <w14:checkedState w14:val="2611" w14:font="MS Gothic"/>
-            <w14:uncheckedState w14:val="2610" w14:font="MS Gothic"/>
-          </w14:checkbox>
-        </w:sdtPr>
-        <w:sdtEndPr/>
-        <w:sdtContent>
-          <w:r>
-            <w:rPr>
-              <w:rFonts w:ascii="MS Gothic" w:eastAsia="MS Gothic" w:hAnsi="MS Gothic" w:cs="MS Gothic"/>
-              <w:sz w:val="21"/>
-            </w:rPr>
-            <w:t>☐</w:t>
-          </w:r>
-        </w:sdtContent>
-      </w:sdt>
-      <w:r>
-        <w:rPr>
-          <w:rFonts w:ascii="Microsoft YaHei" w:hAnsi="Microsoft YaHei" w:eastAsia="Microsoft YaHei" w:cs="Microsoft YaHei"/>
-          <w:b w:val="0"/>
-          <w:sz w:val="21"/>
-        </w:rPr>
-        <w:t xml:space="preserve"> 不对，暂未找到能辨认的记录</w:t>
-      </w:r>
-    </w:p>
-    <w:p>
-      <w:pPr>
-        <w:spacing w:after="100" w:line="276" w:lineRule="auto"/>
-      </w:pPr>
-      <w:sdt>
-        <w:sdtPr>
-          <w:rPr>
-            <w:rFonts w:ascii="MS Gothic" w:eastAsia="MS Gothic" w:hAnsi="MS Gothic" w:cs="MS Gothic"/>
-            <w:sz w:val="21"/>
-          </w:rPr>
-          <w:id w:val="100000008"/>
-          <w14:checkbox>
-            <w14:checked w14:val="0"/>
-            <w14:checkedState w14:val="2611" w14:font="MS Gothic"/>
-            <w14:uncheckedState w14:val="2610" w14:font="MS Gothic"/>
-          </w14:checkbox>
-        </w:sdtPr>
-        <w:sdtEndPr/>
-        <w:sdtContent>
-          <w:r>
-            <w:rPr>
-              <w:rFonts w:ascii="MS Gothic" w:eastAsia="MS Gothic" w:hAnsi="MS Gothic" w:cs="MS Gothic"/>
-              <w:sz w:val="21"/>
-            </w:rPr>
-            <w:t>☐</w:t>
-          </w:r>
-        </w:sdtContent>
-      </w:sdt>
-      <w:r>
-        <w:rPr>
-          <w:rFonts w:ascii="Microsoft YaHei" w:hAnsi="Microsoft YaHei" w:eastAsia="Microsoft YaHei" w:cs="Microsoft YaHei"/>
-          <w:b w:val="0"/>
-          <w:sz w:val="21"/>
-        </w:rPr>
-        <w:t xml:space="preserve"> 不确定，尚未核清</w:t>
-      </w:r>
-    </w:p>
-    <w:p>
-      <w:pPr>
-        <w:keepNext/>
-        <w:pageBreakBefore/>
-        <w:spacing w:after="100" w:line="276" w:lineRule="auto"/>
-      </w:pPr>
-      <w:r>
-        <w:rPr>
-          <w:rFonts w:ascii="Microsoft YaHei" w:hAnsi="Microsoft YaHei" w:eastAsia="Microsoft YaHei" w:cs="Microsoft YaHei"/>
-          <w:b/>
-          <w:sz w:val="21"/>
-        </w:rPr>
-        <w:t>3 判断 已有明确记录允许这些材料用于本轮内部离线验证，并能确定客户隔离范围</w:t>
-      </w:r>
-    </w:p>
-    <w:p>
-      <w:pPr>
-        <w:spacing w:after="100" w:line="276" w:lineRule="auto"/>
-      </w:pPr>
-      <w:sdt>
-        <w:sdtPr>
-          <w:rPr>
-            <w:rFonts w:ascii="MS Gothic" w:eastAsia="MS Gothic" w:hAnsi="MS Gothic" w:cs="MS Gothic"/>
-            <w:sz w:val="21"/>
-          </w:rPr>
-          <w:id w:val="100000009"/>
-          <w14:checkbox>
-            <w14:checked w14:val="0"/>
-            <w14:checkedState w14:val="2611" w14:font="MS Gothic"/>
-            <w14:uncheckedState w14:val="2610" w14:font="MS Gothic"/>
-          </w14:checkbox>
-        </w:sdtPr>
-        <w:sdtEndPr/>
-        <w:sdtContent>
-          <w:r>
-            <w:rPr>
-              <w:rFonts w:ascii="MS Gothic" w:eastAsia="MS Gothic" w:hAnsi="MS Gothic" w:cs="MS Gothic"/>
-              <w:sz w:val="21"/>
-            </w:rPr>
-            <w:t>☐</w:t>
-          </w:r>
-        </w:sdtContent>
-      </w:sdt>
-      <w:r>
-        <w:rPr>
-          <w:rFonts w:ascii="Microsoft YaHei" w:hAnsi="Microsoft YaHei" w:eastAsia="Microsoft YaHei" w:cs="Microsoft YaHei"/>
-          <w:b w:val="0"/>
-          <w:sz w:val="21"/>
-        </w:rPr>
-        <w:t xml:space="preserve"> 对，已有可引用的记录</w:t>
-      </w:r>
-    </w:p>
-    <w:p>
-      <w:pPr>
-        <w:spacing w:after="100" w:line="276" w:lineRule="auto"/>
-      </w:pPr>
-      <w:sdt>
-        <w:sdtPr>
-          <w:rPr>
-            <w:rFonts w:ascii="MS Gothic" w:eastAsia="MS Gothic" w:hAnsi="MS Gothic" w:cs="MS Gothic"/>
-            <w:sz w:val="21"/>
-          </w:rPr>
-          <w:id w:val="100000010"/>
-          <w14:checkbox>
-            <w14:checked w14:val="0"/>
-            <w14:checkedState w14:val="2611" w14:font="MS Gothic"/>
-            <w14:uncheckedState w14:val="2610" w14:font="MS Gothic"/>
-          </w14:checkbox>
-        </w:sdtPr>
-        <w:sdtEndPr/>
-        <w:sdtContent>
-          <w:r>
-            <w:rPr>
-              <w:rFonts w:ascii="MS Gothic" w:eastAsia="MS Gothic" w:hAnsi="MS Gothic" w:cs="MS Gothic"/>
-              <w:sz w:val="21"/>
-            </w:rPr>
-            <w:t>☐</w:t>
-          </w:r>
-        </w:sdtContent>
-      </w:sdt>
-      <w:r>
-        <w:rPr>
-          <w:rFonts w:ascii="Microsoft YaHei" w:hAnsi="Microsoft YaHei" w:eastAsia="Microsoft YaHei" w:cs="Microsoft YaHei"/>
-          <w:b w:val="0"/>
-          <w:sz w:val="21"/>
-        </w:rPr>
-        <w:t xml:space="preserve"> 不完全对，至少一项仍缺记录</w:t>
-      </w:r>
-    </w:p>
-    <w:p>
-      <w:pPr>
-        <w:spacing w:after="100" w:line="276" w:lineRule="auto"/>
-      </w:pPr>
-      <w:sdt>
-        <w:sdtPr>
-          <w:rPr>
-            <w:rFonts w:ascii="MS Gothic" w:eastAsia="MS Gothic" w:hAnsi="MS Gothic" w:cs="MS Gothic"/>
-            <w:sz w:val="21"/>
-          </w:rPr>
-          <w:id w:val="100000011"/>
-          <w14:checkbox>
-            <w14:checked w14:val="0"/>
-            <w14:checkedState w14:val="2611" w14:font="MS Gothic"/>
-            <w14:uncheckedState w14:val="2610" w14:font="MS Gothic"/>
-          </w14:checkbox>
-        </w:sdtPr>
-        <w:sdtEndPr/>
-        <w:sdtContent>
-          <w:r>
-            <w:rPr>
-              <w:rFonts w:ascii="MS Gothic" w:eastAsia="MS Gothic" w:hAnsi="MS Gothic" w:cs="MS Gothic"/>
-              <w:sz w:val="21"/>
-            </w:rPr>
-            <w:t>☐</w:t>
-          </w:r>
-        </w:sdtContent>
-      </w:sdt>
-      <w:r>
-        <w:rPr>
-          <w:rFonts w:ascii="Microsoft YaHei" w:hAnsi="Microsoft YaHei" w:eastAsia="Microsoft YaHei" w:cs="Microsoft YaHei"/>
-          <w:b w:val="0"/>
-          <w:sz w:val="21"/>
-        </w:rPr>
-        <w:t xml:space="preserve"> 不确定，需由相关负责人核对</w:t>
+        <w:t>我们正在核对2026年9月7日至13日的采购数据。当时反馈的数字是下单326行、收货90行。请帮忙找到得出这两个数字的查询记录或当时导出的文件，回复保存位置或链接；如需开权限，给我们只读权限即可。数据由我们直接读取核对。</w:t>
       </w:r>
     </w:p>
     <w:p>
       <w:pPr>
         <w:pStyle w:val="Heading2"/>
-        <w:spacing w:before="260" w:after="100" w:line="276" w:lineRule="auto"/>
+        <w:spacing w:before="260" w:after="120"/>
       </w:pPr>
       <w:r>
         <w:rPr>
@@ -554,152 +116,32 @@
           <w:color w:val="000000"/>
           <w:sz w:val="28"/>
         </w:rPr>
-        <w:t>三 请短填三题</w:t>
+        <w:t>三 回复方式</w:t>
       </w:r>
     </w:p>
     <w:p>
       <w:pPr>
-        <w:keepNext/>
-        <w:spacing w:after="100" w:line="276" w:lineRule="auto"/>
-      </w:pPr>
-      <w:r>
-        <w:rPr>
-          <w:rFonts w:ascii="Microsoft YaHei" w:hAnsi="Microsoft YaHei" w:eastAsia="Microsoft YaHei" w:cs="Microsoft YaHei"/>
-          <w:b/>
-          <w:sz w:val="21"/>
-        </w:rPr>
-        <w:t>4 已找到文件的位置是什么</w:t>
-      </w:r>
-    </w:p>
-    <w:p>
-      <w:pPr>
-        <w:spacing w:after="100" w:line="276" w:lineRule="auto"/>
+        <w:spacing w:after="100"/>
       </w:pPr>
       <w:r>
         <w:rPr>
           <w:rFonts w:ascii="Microsoft YaHei" w:hAnsi="Microsoft YaHei" w:eastAsia="Microsoft YaHei" w:cs="Microsoft YaHei"/>
           <w:b w:val="0"/>
+          <w:color w:val="000000"/>
           <w:sz w:val="21"/>
         </w:rPr>
-        <w:t>填现有完整路径、受控链接或存放负责人即可：________。</w:t>
+        <w:t>方便时先回复找到的一项。没有找到就回“未找到”，还在查找就回“查找中”。例如：“SC8：文件位置或链接；SC2：查找中”。</w:t>
       </w:r>
     </w:p>
     <w:p>
       <w:pPr>
-        <w:spacing w:after="100" w:line="276" w:lineRule="auto"/>
+        <w:spacing w:after="100"/>
       </w:pPr>
       <w:r>
         <w:rPr>
           <w:rFonts w:ascii="Microsoft YaHei" w:hAnsi="Microsoft YaHei" w:eastAsia="Microsoft YaHei" w:cs="Microsoft YaHei"/>
           <w:b w:val="0"/>
-          <w:sz w:val="21"/>
-        </w:rPr>
-        <w:t>暂不能提供可写“暂无”；无需把真实数据放进代码仓库。</w:t>
-      </w:r>
-    </w:p>
-    <w:p>
-      <w:pPr>
-        <w:keepNext/>
-        <w:spacing w:after="100" w:line="276" w:lineRule="auto"/>
-      </w:pPr>
-      <w:r>
-        <w:rPr>
-          <w:rFonts w:ascii="Microsoft YaHei" w:hAnsi="Microsoft YaHei" w:eastAsia="Microsoft YaHei" w:cs="Microsoft YaHei"/>
-          <w:b/>
-          <w:sz w:val="21"/>
-        </w:rPr>
-        <w:t>5 有哪些现成日志 配置或使用记录可引用</w:t>
-      </w:r>
-    </w:p>
-    <w:p>
-      <w:pPr>
-        <w:spacing w:after="100" w:line="276" w:lineRule="auto"/>
-      </w:pPr>
-      <w:r>
-        <w:rPr>
-          <w:rFonts w:ascii="Microsoft YaHei" w:hAnsi="Microsoft YaHei" w:eastAsia="Microsoft YaHei" w:cs="Microsoft YaHei"/>
-          <w:b w:val="0"/>
-          <w:sz w:val="21"/>
-        </w:rPr>
-        <w:t>只填记录的位置或转交相关非敏感片段：________。</w:t>
-      </w:r>
-    </w:p>
-    <w:p>
-      <w:pPr>
-        <w:spacing w:after="100" w:line="276" w:lineRule="auto"/>
-      </w:pPr>
-      <w:r>
-        <w:rPr>
-          <w:rFonts w:ascii="Microsoft YaHei" w:hAnsi="Microsoft YaHei" w:eastAsia="Microsoft YaHei" w:cs="Microsoft YaHei"/>
-          <w:b w:val="0"/>
-          <w:sz w:val="21"/>
-        </w:rPr>
-        <w:t>若现有记录已包括数据来源、采集时间和时区、筛选范围、混用 mock 的部分、当时净库存／在途 PO 开关及 BOM 深度，请提供对应部分即可；没有的项目留空或写“未核清”。第3题的使用依据也请给现有记录的位置，不要求补写说明书。不提供账号、密码或令牌。</w:t>
-      </w:r>
-    </w:p>
-    <w:p>
-      <w:pPr>
-        <w:keepNext/>
-        <w:spacing w:after="100" w:line="276" w:lineRule="auto"/>
-      </w:pPr>
-      <w:r>
-        <w:rPr>
-          <w:rFonts w:ascii="Microsoft YaHei" w:hAnsi="Microsoft YaHei" w:eastAsia="Microsoft YaHei" w:cs="Microsoft YaHei"/>
-          <w:b/>
-          <w:sz w:val="21"/>
-        </w:rPr>
-        <w:t>6 尚未核清的部分由谁继续核对 预计何时可回复</w:t>
-      </w:r>
-    </w:p>
-    <w:p>
-      <w:pPr>
-        <w:spacing w:after="100" w:line="276" w:lineRule="auto"/>
-      </w:pPr>
-      <w:r>
-        <w:rPr>
-          <w:rFonts w:ascii="Microsoft YaHei" w:hAnsi="Microsoft YaHei" w:eastAsia="Microsoft YaHei" w:cs="Microsoft YaHei"/>
-          <w:b w:val="0"/>
-          <w:sz w:val="21"/>
-        </w:rPr>
-        <w:t>题号／负责人／预计时间：________。时间暂不能确定可写“待定”。</w:t>
-      </w:r>
-    </w:p>
-    <w:p>
-      <w:pPr>
-        <w:pStyle w:val="Heading2"/>
-        <w:spacing w:before="260" w:after="100" w:line="276" w:lineRule="auto"/>
-      </w:pPr>
-      <w:r>
-        <w:rPr>
-          <w:rFonts w:ascii="Microsoft YaHei" w:hAnsi="Microsoft YaHei" w:eastAsia="Microsoft YaHei" w:cs="Microsoft YaHei"/>
-          <w:b/>
           <w:color w:val="000000"/>
-          <w:sz w:val="28"/>
-        </w:rPr>
-        <w:t>四 怎么交</w:t>
-      </w:r>
-    </w:p>
-    <w:p>
-      <w:pPr>
-        <w:spacing w:after="100" w:line="276" w:lineRule="auto"/>
-      </w:pPr>
-      <w:r>
-        <w:rPr>
-          <w:rFonts w:ascii="Microsoft YaHei" w:hAnsi="Microsoft YaHei" w:eastAsia="Microsoft YaHei" w:cs="Microsoft YaHei"/>
-          <w:b w:val="0"/>
-          <w:sz w:val="21"/>
-        </w:rPr>
-        <w:t>可直接在 Word 勾选后回传，也可按“1A、2不完全对、3不确定，4……，5……，6……”回复。方便时先回已有部分；没有资料就明确写“暂无”。本信只核对材料事实，后续确需重新取数另行安排。</w:t>
-      </w:r>
-    </w:p>
-    <w:p>
-      <w:pPr>
-        <w:spacing w:after="100" w:line="276" w:lineRule="auto"/>
-      </w:pPr>
-      <w:r>
-        <w:rPr>
-          <w:rFonts w:ascii="Microsoft YaHei" w:hAnsi="Microsoft YaHei" w:eastAsia="Microsoft YaHei" w:cs="Microsoft YaHei"/>
-          <w:b w:val="0"/>
           <w:sz w:val="21"/>
         </w:rPr>
         <w:t>—— OPVP Shao Peishen</w:t>
@@ -707,15 +149,16 @@
     </w:p>
     <w:p>
       <w:pPr>
-        <w:spacing w:after="100" w:line="276" w:lineRule="auto"/>
+        <w:spacing w:after="100"/>
       </w:pPr>
       <w:r>
         <w:rPr>
           <w:rFonts w:ascii="Microsoft YaHei" w:hAnsi="Microsoft YaHei" w:eastAsia="Microsoft YaHei" w:cs="Microsoft YaHei"/>
           <w:b w:val="0"/>
+          <w:color w:val="000000"/>
           <w:sz w:val="21"/>
         </w:rPr>
-        <w:t>2026年10月7日</w:t>
+        <w:t>2026年10月8日</w:t>
       </w:r>
     </w:p>
     <w:sectPr>
@@ -820,7 +263,7 @@
         <w:color w:val="000000"/>
         <w:sz w:val="16"/>
       </w:rPr>
-      <w:t>IT部第14封跟进信 SC8现有记录核对</w:t>
+      <w:t>IT部第14封跟进信 请协助查找两项记录</w:t>
     </w:r>
   </w:p>
 </w:hdr>
@@ -1189,9 +632,13 @@
     <w:name w:val="Normal"/>
     <w:qFormat/>
     <w:rsid w:val="00FC693F"/>
+    <w:pPr>
+      <w:spacing w:line="276" w:lineRule="auto" w:after="100"/>
+    </w:pPr>
     <w:rPr>
       <w:rFonts w:ascii="Microsoft YaHei" w:hAnsi="Microsoft YaHei" w:eastAsia="Microsoft YaHei" w:cs="Microsoft YaHei"/>
-      <w:sz w:val="21"/>
+      <w:color w:val="000000"/>
+      <w:sz w:val="22"/>
     </w:rPr>
   </w:style>
   <w:style w:type="paragraph" w:styleId="Header">
@@ -1249,7 +696,7 @@
     <w:pPr>
       <w:keepNext/>
       <w:keepLines/>
-      <w:spacing w:before="480" w:after="0"/>
+      <w:spacing w:before="160" w:after="80"/>
       <w:outlineLvl w:val="0"/>
     </w:pPr>
     <w:rPr>
@@ -1257,7 +704,7 @@
       <w:b/>
       <w:bCs/>
       <w:color w:val="000000"/>
-      <w:sz w:val="32"/>
+      <w:sz w:val="24"/>
       <w:szCs w:val="28"/>
     </w:rPr>
   </w:style>
@@ -1273,7 +720,7 @@
     <w:pPr>
       <w:keepNext/>
       <w:keepLines/>
-      <w:spacing w:before="200" w:after="0"/>
+      <w:spacing w:before="160" w:after="80"/>
       <w:outlineLvl w:val="1"/>
     </w:pPr>
     <w:rPr>
@@ -1281,7 +728,7 @@
       <w:b/>
       <w:bCs/>
       <w:color w:val="000000"/>
-      <w:sz w:val="28"/>
+      <w:sz w:val="24"/>
       <w:szCs w:val="26"/>
     </w:rPr>
   </w:style>
@@ -1297,7 +744,7 @@
     <w:pPr>
       <w:keepNext/>
       <w:keepLines/>
-      <w:spacing w:before="200" w:after="0"/>
+      <w:spacing w:before="160" w:after="80"/>
       <w:outlineLvl w:val="2"/>
     </w:pPr>
     <w:rPr>
@@ -1305,7 +752,7 @@
       <w:b/>
       <w:bCs/>
       <w:color w:val="000000"/>
-      <w:sz w:val="25"/>
+      <w:sz w:val="24"/>
     </w:rPr>
   </w:style>
   <w:style w:type="paragraph" w:styleId="Heading4">
@@ -1539,16 +986,14 @@
     <w:qFormat/>
     <w:rsid w:val="00FC693F"/>
     <w:pPr>
-      <w:spacing w:after="300" w:line="240" w:lineRule="auto"/>
-      <w:contextualSpacing/>
+      <w:spacing w:after="200"/>
     </w:pPr>
     <w:rPr>
-      <w:rFonts w:asciiTheme="majorHAnsi" w:eastAsiaTheme="majorEastAsia" w:hAnsiTheme="majorHAnsi" w:cstheme="majorBidi"/>
+      <w:rFonts w:ascii="Microsoft YaHei" w:hAnsi="Microsoft YaHei"/>
+      <w:b/>
+      <w:vanish w:val="0"/>
       <w:color w:val="000000"/>
-      <w:spacing w:val="5"/>
-      <w:kern w:val="28"/>
-      <w:sz w:val="52"/>
-      <w:szCs w:val="52"/>
+      <w:sz w:val="36"/>
     </w:rPr>
   </w:style>
   <w:style w:type="character" w:customStyle="1" w:styleId="TitleChar">
@@ -1583,7 +1028,7 @@
       <w:rFonts w:asciiTheme="majorHAnsi" w:eastAsiaTheme="majorEastAsia" w:hAnsiTheme="majorHAnsi" w:cstheme="majorBidi"/>
       <w:i/>
       <w:iCs/>
-      <w:color w:val="000000"/>
+      <w:color w:val="4F81BD" w:themeColor="accent1"/>
       <w:spacing w:val="15"/>
       <w:sz w:val="24"/>
       <w:szCs w:val="24"/>

</xml_diff>